<commit_message>
feat: template don nghi phep ho tro dieu kien 2 nam
Co-Authored-By: Claude Sonnet 4.6 <noreply@anthropic.com>
</commit_message>
<xml_diff>
--- a/templates/don_xin_nghi_phep_tpl.docx
+++ b/templates/don_xin_nghi_phep_tpl.docx
@@ -181,7 +181,7 @@
     </w:p>
     <w:p>
       <w:pPr>
-        <w:spacing w:before="120" w:after="120" w:line="276" w:lineRule="auto"/>
+        <w:spacing w:before="60" w:after="60" w:line="276" w:lineRule="auto"/>
         <w:jc w:val="both"/>
         <w:rPr>
           <w:sz w:val="28"/>
@@ -190,7 +190,7 @@
     </w:p>
     <w:p>
       <w:pPr>
-        <w:spacing w:before="120" w:after="120" w:line="276" w:lineRule="auto"/>
+        <w:spacing w:before="60" w:after="60" w:line="276" w:lineRule="auto"/>
         <w:ind w:left="142"/>
         <w:jc w:val="both"/>
         <w:rPr>
@@ -236,7 +236,7 @@
     </w:p>
     <w:p>
       <w:pPr>
-        <w:spacing w:before="120" w:after="120" w:line="276" w:lineRule="auto"/>
+        <w:spacing w:before="60" w:after="60" w:line="276" w:lineRule="auto"/>
         <w:ind w:left="142"/>
         <w:jc w:val="both"/>
         <w:rPr>
@@ -258,7 +258,15 @@
     </w:p>
     <w:p>
       <w:pPr>
-        <w:spacing w:before="120" w:after="120" w:line="276" w:lineRule="auto"/>
+        <w:jc w:val="left"/>
+      </w:pPr>
+      <w:r>
+        <w:t>{%p if not has_carryover %}</w:t>
+      </w:r>
+    </w:p>
+    <w:p>
+      <w:pPr>
+        <w:spacing w:before="60" w:after="60" w:line="276" w:lineRule="auto"/>
         <w:ind w:left="142"/>
         <w:jc w:val="both"/>
         <w:rPr>
@@ -283,7 +291,7 @@
     </w:p>
     <w:p>
       <w:pPr>
-        <w:spacing w:before="120" w:after="120" w:line="276" w:lineRule="auto"/>
+        <w:spacing w:before="60" w:after="60" w:line="276" w:lineRule="auto"/>
         <w:ind w:left="142"/>
         <w:jc w:val="both"/>
         <w:rPr>
@@ -300,7 +308,7 @@
     </w:p>
     <w:p>
       <w:pPr>
-        <w:spacing w:before="120" w:after="120" w:line="276" w:lineRule="auto"/>
+        <w:spacing w:before="60" w:after="60" w:line="276" w:lineRule="auto"/>
         <w:ind w:left="142"/>
         <w:jc w:val="both"/>
         <w:rPr>
@@ -317,7 +325,7 @@
     </w:p>
     <w:p>
       <w:pPr>
-        <w:spacing w:before="120" w:after="120" w:line="276" w:lineRule="auto"/>
+        <w:spacing w:before="60" w:after="60" w:line="276" w:lineRule="auto"/>
         <w:ind w:left="142"/>
         <w:jc w:val="both"/>
         <w:rPr>
@@ -334,7 +342,7 @@
     </w:p>
     <w:p>
       <w:pPr>
-        <w:spacing w:before="120" w:after="120" w:line="276" w:lineRule="auto"/>
+        <w:spacing w:before="60" w:after="60" w:line="276" w:lineRule="auto"/>
         <w:ind w:left="142"/>
         <w:jc w:val="both"/>
         <w:rPr>
@@ -353,6 +361,166 @@
           <w:sz w:val="28"/>
         </w:rPr>
         <w:t xml:space="preserve">          </w:t>
+      </w:r>
+    </w:p>
+    <w:p>
+      <w:pPr>
+        <w:jc w:val="left"/>
+      </w:pPr>
+      <w:r>
+        <w:t>{%p else %}</w:t>
+      </w:r>
+    </w:p>
+    <w:p>
+      <w:pPr>
+        <w:spacing w:before="60" w:after="60" w:line="276" w:lineRule="auto"/>
+        <w:ind w:left="142"/>
+        <w:jc w:val="both"/>
+        <w:rPr>
+          <w:spacing w:val="-2"/>
+          <w:sz w:val="28"/>
+        </w:rPr>
+      </w:pPr>
+      <w:r>
+        <w:rPr>
+          <w:spacing w:val="-2"/>
+          <w:sz w:val="28"/>
+        </w:rPr>
+        <w:t xml:space="preserve">Tôi làm Đơn này kính đề nghị Giám đốc Trung tâm Thanh toán cho tôi được </w:t>
+      </w:r>
+      <w:r>
+        <w:rPr>
+          <w:spacing w:val="-2"/>
+          <w:sz w:val="28"/>
+        </w:rPr>
+        <w:t>nghỉ phép của năm {{ prev_year }} và {{ nam_phep }}, cụ thể như sau:</w:t>
+      </w:r>
+    </w:p>
+    <w:p>
+      <w:pPr>
+        <w:spacing w:before="60" w:after="60" w:line="276" w:lineRule="auto"/>
+        <w:ind w:left="142"/>
+        <w:jc w:val="both"/>
+        <w:rPr>
+          <w:sz w:val="28"/>
+        </w:rPr>
+      </w:pPr>
+      <w:r>
+        <w:rPr>
+          <w:b/>
+          <w:sz w:val="28"/>
+        </w:rPr>
+        <w:t xml:space="preserve">Tổng số ngày phép năm {{ prev_year }}: {{ tong_so_phep_prev }} ngày</w:t>
+      </w:r>
+    </w:p>
+    <w:p>
+      <w:pPr>
+        <w:spacing w:before="60" w:after="60" w:line="276" w:lineRule="auto"/>
+        <w:ind w:left="142"/>
+        <w:jc w:val="both"/>
+        <w:rPr>
+          <w:sz w:val="28"/>
+        </w:rPr>
+      </w:pPr>
+      <w:r>
+        <w:rPr>
+          <w:b/>
+          <w:sz w:val="28"/>
+        </w:rPr>
+        <w:t>Tổng số ngày phép năm {{ nam_phep }}: {{ tong_so_phep }} ngày</w:t>
+      </w:r>
+    </w:p>
+    <w:p>
+      <w:pPr>
+        <w:spacing w:before="60" w:after="60" w:line="276" w:lineRule="auto"/>
+        <w:ind w:left="142"/>
+        <w:jc w:val="both"/>
+        <w:rPr>
+          <w:sz w:val="28"/>
+        </w:rPr>
+      </w:pPr>
+      <w:r>
+        <w:rPr>
+          <w:b/>
+          <w:sz w:val="28"/>
+        </w:rPr>
+        <w:t xml:space="preserve">Số ngày phép đã nghỉ năm {{ prev_year }}: {{ da_nghi_prev }} ngày</w:t>
+      </w:r>
+    </w:p>
+    <w:p>
+      <w:pPr>
+        <w:spacing w:before="60" w:after="60" w:line="276" w:lineRule="auto"/>
+        <w:ind w:left="142"/>
+        <w:jc w:val="both"/>
+        <w:rPr>
+          <w:sz w:val="28"/>
+        </w:rPr>
+      </w:pPr>
+      <w:r>
+        <w:rPr>
+          <w:b/>
+          <w:sz w:val="28"/>
+        </w:rPr>
+        <w:t xml:space="preserve">Số ngày phép đã nghỉ năm {{ nam_phep }}: {{ da_nghi_cur }} ngày</w:t>
+      </w:r>
+    </w:p>
+    <w:p>
+      <w:pPr>
+        <w:spacing w:before="60" w:after="60" w:line="276" w:lineRule="auto"/>
+        <w:ind w:left="142"/>
+        <w:jc w:val="both"/>
+        <w:rPr>
+          <w:sz w:val="28"/>
+        </w:rPr>
+      </w:pPr>
+      <w:r>
+        <w:rPr>
+          <w:b/>
+          <w:sz w:val="28"/>
+        </w:rPr>
+        <w:t>Số ngày phép xin nghỉ: {{ so_ngay_xin_nghi }}</w:t>
+      </w:r>
+    </w:p>
+    <w:p>
+      <w:pPr>
+        <w:spacing w:before="60" w:after="60" w:line="276" w:lineRule="auto"/>
+        <w:ind w:left="142"/>
+        <w:jc w:val="both"/>
+        <w:rPr>
+          <w:sz w:val="28"/>
+        </w:rPr>
+      </w:pPr>
+      <w:r>
+        <w:rPr>
+          <w:b/>
+          <w:sz w:val="28"/>
+        </w:rPr>
+        <w:t xml:space="preserve">Số ngày phép còn lại sau khi nghỉ của năm {{ prev_year }}: {{ con_lai_prev }} ngày</w:t>
+      </w:r>
+    </w:p>
+    <w:p>
+      <w:pPr>
+        <w:spacing w:before="60" w:after="60" w:line="276" w:lineRule="auto"/>
+        <w:ind w:left="142"/>
+        <w:jc w:val="both"/>
+        <w:rPr>
+          <w:sz w:val="28"/>
+        </w:rPr>
+      </w:pPr>
+      <w:r>
+        <w:rPr>
+          <w:b/>
+          <w:sz w:val="28"/>
+        </w:rPr>
+        <w:t xml:space="preserve">Số ngày phép còn lại sau khi nghỉ của năm {{ nam_phep }}: {{ con_lai_cur }} ngày</w:t>
+      </w:r>
+    </w:p>
+    <w:p>
+      <w:pPr>
+        <w:jc w:val="left"/>
+      </w:pPr>
+      <w:r>
+        <w:t>{%p endif %}</w:t>
       </w:r>
     </w:p>
     <w:p>
@@ -360,9 +528,9 @@
         <w:tabs>
           <w:tab w:val="left" w:pos="851"/>
         </w:tabs>
-        <w:spacing w:before="120" w:after="120" w:line="276" w:lineRule="auto"/>
+        <w:spacing w:before="60" w:after="60" w:line="276" w:lineRule="auto"/>
         <w:ind w:left="142"/>
-        <w:jc w:val="both"/>
+        <w:jc w:val="left"/>
         <w:rPr>
           <w:sz w:val="28"/>
         </w:rPr>
@@ -392,9 +560,9 @@
         <w:tabs>
           <w:tab w:val="left" w:pos="851"/>
         </w:tabs>
-        <w:spacing w:before="120" w:after="120" w:line="276" w:lineRule="auto"/>
+        <w:spacing w:before="60" w:after="60" w:line="276" w:lineRule="auto"/>
         <w:ind w:left="142"/>
-        <w:jc w:val="both"/>
+        <w:jc w:val="left"/>
         <w:rPr>
           <w:sz w:val="28"/>
         </w:rPr>
@@ -429,7 +597,7 @@
         <w:tabs>
           <w:tab w:val="left" w:pos="851"/>
         </w:tabs>
-        <w:spacing w:before="120" w:after="120" w:line="276" w:lineRule="auto"/>
+        <w:spacing w:before="60" w:after="60" w:line="276" w:lineRule="auto"/>
         <w:ind w:left="142"/>
         <w:jc w:val="both"/>
         <w:rPr>
@@ -451,7 +619,7 @@
     </w:p>
     <w:p>
       <w:pPr>
-        <w:spacing w:line="360" w:lineRule="auto"/>
+        <w:spacing w:line="276" w:lineRule="auto"/>
         <w:rPr>
           <w:i/>
           <w:sz w:val="28"/>
@@ -529,7 +697,8 @@
           </w:tcPr>
           <w:p>
             <w:pPr>
-              <w:spacing w:line="360" w:lineRule="auto"/>
+              <w:jc w:val="center"/>
+              <w:spacing w:line="276" w:lineRule="auto"/>
               <w:rPr>
                 <w:sz w:val="28"/>
               </w:rPr>
@@ -540,16 +709,135 @@
                 <w:sz w:val="24"/>
                 <w:szCs w:val="24"/>
               </w:rPr>
-              <w:t xml:space="preserve">TRƯỞNG PHÒNG </w:t>
+              <w:t>{{ ksv_dept_label }}</w:t>
             </w:r>
+          </w:p>
+          <w:p>
+            <w:pPr>
+              <w:spacing w:line="276" w:lineRule="auto"/>
+              <w:jc w:val="center"/>
+              <w:rPr>
+                <w:b/>
+                <w:sz w:val="24"/>
+                <w:szCs w:val="24"/>
+              </w:rPr>
+            </w:pPr>
             <w:r>
               <w:rPr>
                 <w:b/>
                 <w:sz w:val="24"/>
                 <w:szCs w:val="24"/>
               </w:rPr>
-              <w:t>KSNB&amp;HTVH</w:t>
+              <w:t xml:space="preserve">{% if ksv_dept_label_line2 %}{{ ksv_dept_label_line2 }}{% endif %}</w:t>
             </w:r>
+          </w:p>
+          <w:p>
+            <w:pPr>
+              <w:spacing w:line="276" w:lineRule="auto"/>
+              <w:jc w:val="center"/>
+              <w:rPr/>
+            </w:pPr>
+          </w:p>
+          <w:p>
+            <w:pPr>
+              <w:spacing w:line="276" w:lineRule="auto"/>
+              <w:jc w:val="center"/>
+              <w:rPr/>
+            </w:pPr>
+          </w:p>
+          <w:p>
+            <w:pPr>
+              <w:spacing w:line="276" w:lineRule="auto"/>
+              <w:jc w:val="center"/>
+              <w:rPr/>
+            </w:pPr>
+          </w:p>
+          <w:p>
+            <w:pPr>
+              <w:spacing w:line="276" w:lineRule="auto"/>
+              <w:jc w:val="center"/>
+              <w:rPr>
+                <w:b/>
+                <w:sz w:val="28"/>
+              </w:rPr>
+            </w:pPr>
+            <w:r>
+              <w:rPr>
+                <w:b/>
+                <w:sz w:val="28"/>
+              </w:rPr>
+              <w:t>{{ ksv_name }}</w:t>
+            </w:r>
+          </w:p>
+          <w:p>
+            <w:pPr>
+              <w:jc w:val="center"/>
+              <w:rPr>
+                <w:sz w:val="28"/>
+              </w:rPr>
+            </w:pPr>
+            <w:r>
+              <w:rPr>
+                <w:b/>
+                <w:sz w:val="24"/>
+                <w:szCs w:val="24"/>
+              </w:rPr>
+              <w:t>XÁC NHẬN CỦA P. TỔNG HỢP</w:t>
+            </w:r>
+          </w:p>
+          <w:p>
+            <w:pPr>
+              <w:jc w:val="center"/>
+              <w:rPr>
+                <w:sz w:val="24"/>
+                <w:szCs w:val="24"/>
+              </w:rPr>
+            </w:pPr>
+          </w:p>
+          <w:p>
+            <w:pPr>
+              <w:jc w:val="center"/>
+              <w:rPr>
+                <w:sz w:val="24"/>
+                <w:szCs w:val="24"/>
+              </w:rPr>
+            </w:pPr>
+          </w:p>
+          <w:p>
+            <w:pPr>
+              <w:jc w:val="center"/>
+              <w:rPr>
+                <w:sz w:val="24"/>
+                <w:szCs w:val="24"/>
+              </w:rPr>
+            </w:pPr>
+          </w:p>
+          <w:p>
+            <w:pPr>
+              <w:jc w:val="center"/>
+              <w:rPr>
+                <w:sz w:val="24"/>
+                <w:szCs w:val="24"/>
+              </w:rPr>
+            </w:pPr>
+          </w:p>
+          <w:p>
+            <w:pPr>
+              <w:jc w:val="center"/>
+              <w:rPr>
+                <w:sz w:val="24"/>
+                <w:szCs w:val="24"/>
+              </w:rPr>
+            </w:pPr>
+          </w:p>
+          <w:p>
+            <w:pPr>
+              <w:jc w:val="center"/>
+              <w:rPr>
+                <w:sz w:val="24"/>
+                <w:szCs w:val="24"/>
+              </w:rPr>
+            </w:pPr>
           </w:p>
         </w:tc>
         <w:tc>
@@ -559,7 +847,7 @@
           </w:tcPr>
           <w:p>
             <w:pPr>
-              <w:spacing w:line="360" w:lineRule="auto"/>
+              <w:spacing w:line="276" w:lineRule="auto"/>
               <w:jc w:val="center"/>
               <w:rPr>
                 <w:b/>
@@ -573,43 +861,163 @@
                 <w:sz w:val="24"/>
                 <w:szCs w:val="24"/>
               </w:rPr>
-              <w:t>NGƯỜI  ĐỀ NGHỊ</w:t>
+              <w:t>NGƯỜI ĐỀ NGHỊ</w:t>
             </w:r>
           </w:p>
           <w:p>
             <w:pPr>
-              <w:spacing w:line="360" w:lineRule="auto"/>
-              <w:rPr>
-                <w:b/>
-                <w:sz w:val="24"/>
-                <w:szCs w:val="24"/>
-              </w:rPr>
-            </w:pPr>
-          </w:p>
-          <w:p>
-            <w:pPr>
-              <w:spacing w:line="360" w:lineRule="auto"/>
-              <w:jc w:val="center"/>
-              <w:rPr>
-                <w:b/>
-                <w:sz w:val="24"/>
-                <w:szCs w:val="24"/>
-              </w:rPr>
-            </w:pPr>
-          </w:p>
-          <w:p>
-            <w:pPr>
-              <w:spacing w:line="360" w:lineRule="auto"/>
-              <w:rPr>
-                <w:b/>
-                <w:sz w:val="24"/>
-                <w:szCs w:val="24"/>
-              </w:rPr>
-            </w:pPr>
-          </w:p>
-          <w:p>
-            <w:pPr>
-              <w:spacing w:line="360" w:lineRule="auto"/>
+              <w:spacing w:line="276" w:lineRule="auto"/>
+              <w:rPr>
+                <w:b/>
+                <w:sz w:val="24"/>
+                <w:szCs w:val="24"/>
+              </w:rPr>
+            </w:pPr>
+          </w:p>
+          <w:p>
+            <w:pPr>
+              <w:spacing w:line="276" w:lineRule="auto"/>
+              <w:jc w:val="center"/>
+              <w:rPr>
+                <w:b/>
+                <w:sz w:val="24"/>
+                <w:szCs w:val="24"/>
+              </w:rPr>
+            </w:pPr>
+          </w:p>
+          <w:p>
+            <w:pPr>
+              <w:spacing w:line="276" w:lineRule="auto"/>
+              <w:rPr>
+                <w:b/>
+                <w:sz w:val="24"/>
+                <w:szCs w:val="24"/>
+              </w:rPr>
+            </w:pPr>
+          </w:p>
+          <w:p>
+            <w:pPr>
+              <w:spacing w:line="276" w:lineRule="auto"/>
+              <w:jc w:val="center"/>
+              <w:rPr>
+                <w:b/>
+                <w:sz w:val="24"/>
+                <w:szCs w:val="24"/>
+              </w:rPr>
+            </w:pPr>
+          </w:p>
+          <w:p>
+            <w:pPr>
+              <w:spacing w:line="276" w:lineRule="auto"/>
+              <w:jc w:val="center"/>
+              <w:rPr>
+                <w:b/>
+                <w:sz w:val="28"/>
+              </w:rPr>
+            </w:pPr>
+            <w:r>
+              <w:rPr>
+                <w:b/>
+                <w:sz w:val="28"/>
+              </w:rPr>
+              <w:t>{{ ho_va_ten }}</w:t>
+            </w:r>
+          </w:p>
+          <w:p>
+            <w:pPr>
+              <w:ind w:left="142" w:hanging="142"/>
+              <w:jc w:val="center"/>
+              <w:rPr>
+                <w:sz w:val="28"/>
+              </w:rPr>
+            </w:pPr>
+            <w:r>
+              <w:rPr>
+                <w:b/>
+                <w:sz w:val="24"/>
+                <w:szCs w:val="24"/>
+              </w:rPr>
+              <w:t>TUQ.</w:t>
+            </w:r>
+            <w:r>
+              <w:rPr>
+                <w:b/>
+                <w:sz w:val="24"/>
+                <w:szCs w:val="24"/>
+              </w:rPr>
+              <w:t xml:space="preserve"> GIÁM ĐỐC TTTT</w:t>
+            </w:r>
+          </w:p>
+          <w:p>
+            <w:pPr>
+              <w:jc w:val="center"/>
+              <w:rPr>
+                <w:b/>
+                <w:sz w:val="24"/>
+                <w:szCs w:val="24"/>
+              </w:rPr>
+            </w:pPr>
+            <w:r>
+              <w:rPr>
+                <w:b/>
+                <w:sz w:val="24"/>
+                <w:szCs w:val="24"/>
+              </w:rPr>
+              <w:t>PHÓ GIÁM ĐỐC</w:t>
+            </w:r>
+          </w:p>
+          <w:p>
+            <w:pPr>
+              <w:jc w:val="center"/>
+              <w:rPr>
+                <w:b/>
+                <w:sz w:val="24"/>
+                <w:szCs w:val="24"/>
+              </w:rPr>
+            </w:pPr>
+          </w:p>
+          <w:p>
+            <w:pPr>
+              <w:jc w:val="center"/>
+              <w:rPr>
+                <w:b/>
+                <w:sz w:val="24"/>
+                <w:szCs w:val="24"/>
+              </w:rPr>
+            </w:pPr>
+          </w:p>
+          <w:p>
+            <w:pPr>
+              <w:jc w:val="center"/>
+              <w:rPr>
+                <w:b/>
+                <w:sz w:val="24"/>
+                <w:szCs w:val="24"/>
+              </w:rPr>
+            </w:pPr>
+          </w:p>
+          <w:p>
+            <w:pPr>
+              <w:jc w:val="center"/>
+              <w:rPr>
+                <w:b/>
+                <w:sz w:val="24"/>
+                <w:szCs w:val="24"/>
+              </w:rPr>
+            </w:pPr>
+          </w:p>
+          <w:p>
+            <w:pPr>
+              <w:jc w:val="center"/>
+              <w:rPr>
+                <w:b/>
+                <w:sz w:val="24"/>
+                <w:szCs w:val="24"/>
+              </w:rPr>
+            </w:pPr>
+          </w:p>
+          <w:p>
+            <w:pPr>
               <w:jc w:val="center"/>
               <w:rPr>
                 <w:b/>
@@ -631,26 +1039,12 @@
           </w:tcPr>
           <w:p>
             <w:pPr>
-              <w:spacing w:line="360" w:lineRule="auto"/>
-              <w:rPr>
-                <w:b/>
-                <w:sz w:val="28"/>
-              </w:rPr>
-            </w:pPr>
-            <w:r>
-              <w:rPr>
-                <w:b/>
-                <w:sz w:val="28"/>
-              </w:rPr>
-              <w:t xml:space="preserve">          </w:t>
-            </w:r>
-            <w:r>
-              <w:rPr>
-                <w:b/>
-                <w:sz w:val="28"/>
-              </w:rPr>
-              <w:t>{{ ksv_name }}</w:t>
-            </w:r>
+              <w:rPr>
+                <w:b/>
+                <w:sz w:val="24"/>
+                <w:szCs w:val="24"/>
+              </w:rPr>
+            </w:pPr>
           </w:p>
         </w:tc>
         <w:tc>
@@ -660,184 +1054,6 @@
           </w:tcPr>
           <w:p>
             <w:pPr>
-              <w:spacing w:line="360" w:lineRule="auto"/>
-              <w:jc w:val="center"/>
-              <w:rPr>
-                <w:b/>
-                <w:sz w:val="28"/>
-              </w:rPr>
-            </w:pPr>
-            <w:r>
-              <w:rPr>
-                <w:b/>
-                <w:sz w:val="28"/>
-              </w:rPr>
-              <w:t>{{ ho_va_ten }}</w:t>
-            </w:r>
-          </w:p>
-        </w:tc>
-      </w:tr>
-      <w:tr>
-        <w:trPr>
-          <w:jc w:val="center"/>
-        </w:trPr>
-        <w:tc>
-          <w:tcPr>
-            <w:tcW w:w="4573" w:type="dxa"/>
-            <w:shd w:val="clear" w:color="auto" w:fill="auto"/>
-          </w:tcPr>
-          <w:p>
-            <w:pPr>
-              <w:rPr>
-                <w:sz w:val="28"/>
-              </w:rPr>
-            </w:pPr>
-            <w:r>
-              <w:rPr>
-                <w:b/>
-                <w:sz w:val="24"/>
-                <w:szCs w:val="24"/>
-              </w:rPr>
-              <w:t>XÁC NHẬN CỦA P. TỔNG HỢP</w:t>
-            </w:r>
-          </w:p>
-        </w:tc>
-        <w:tc>
-          <w:tcPr>
-            <w:tcW w:w="4573" w:type="dxa"/>
-            <w:shd w:val="clear" w:color="auto" w:fill="auto"/>
-          </w:tcPr>
-          <w:p>
-            <w:pPr>
-              <w:ind w:left="142" w:hanging="142"/>
-              <w:jc w:val="center"/>
-              <w:rPr>
-                <w:sz w:val="28"/>
-              </w:rPr>
-            </w:pPr>
-            <w:r>
-              <w:rPr>
-                <w:b/>
-                <w:sz w:val="24"/>
-                <w:szCs w:val="24"/>
-              </w:rPr>
-              <w:t>TUQ.</w:t>
-            </w:r>
-            <w:r>
-              <w:rPr>
-                <w:b/>
-                <w:sz w:val="24"/>
-                <w:szCs w:val="24"/>
-              </w:rPr>
-              <w:t xml:space="preserve"> GIÁM ĐỐC TTTT</w:t>
-            </w:r>
-          </w:p>
-          <w:p>
-            <w:pPr>
-              <w:jc w:val="center"/>
-              <w:rPr>
-                <w:b/>
-                <w:sz w:val="24"/>
-                <w:szCs w:val="24"/>
-              </w:rPr>
-            </w:pPr>
-            <w:r>
-              <w:rPr>
-                <w:b/>
-                <w:sz w:val="24"/>
-                <w:szCs w:val="24"/>
-              </w:rPr>
-              <w:t>PHÓ GIÁM ĐỐC</w:t>
-            </w:r>
-          </w:p>
-          <w:p>
-            <w:pPr>
-              <w:jc w:val="center"/>
-              <w:rPr>
-                <w:b/>
-                <w:sz w:val="24"/>
-                <w:szCs w:val="24"/>
-              </w:rPr>
-            </w:pPr>
-          </w:p>
-          <w:p>
-            <w:pPr>
-              <w:jc w:val="center"/>
-              <w:rPr>
-                <w:b/>
-                <w:sz w:val="24"/>
-                <w:szCs w:val="24"/>
-              </w:rPr>
-            </w:pPr>
-          </w:p>
-          <w:p>
-            <w:pPr>
-              <w:jc w:val="center"/>
-              <w:rPr>
-                <w:b/>
-                <w:sz w:val="24"/>
-                <w:szCs w:val="24"/>
-              </w:rPr>
-            </w:pPr>
-          </w:p>
-          <w:p>
-            <w:pPr>
-              <w:jc w:val="center"/>
-              <w:rPr>
-                <w:b/>
-                <w:sz w:val="24"/>
-                <w:szCs w:val="24"/>
-              </w:rPr>
-            </w:pPr>
-          </w:p>
-          <w:p>
-            <w:pPr>
-              <w:jc w:val="center"/>
-              <w:rPr>
-                <w:b/>
-                <w:sz w:val="24"/>
-                <w:szCs w:val="24"/>
-              </w:rPr>
-            </w:pPr>
-          </w:p>
-          <w:p>
-            <w:pPr>
-              <w:jc w:val="center"/>
-              <w:rPr>
-                <w:b/>
-                <w:sz w:val="24"/>
-                <w:szCs w:val="24"/>
-              </w:rPr>
-            </w:pPr>
-          </w:p>
-        </w:tc>
-      </w:tr>
-      <w:tr>
-        <w:trPr>
-          <w:jc w:val="center"/>
-        </w:trPr>
-        <w:tc>
-          <w:tcPr>
-            <w:tcW w:w="4573" w:type="dxa"/>
-            <w:shd w:val="clear" w:color="auto" w:fill="auto"/>
-          </w:tcPr>
-          <w:p>
-            <w:pPr>
-              <w:rPr>
-                <w:b/>
-                <w:sz w:val="24"/>
-                <w:szCs w:val="24"/>
-              </w:rPr>
-            </w:pPr>
-          </w:p>
-        </w:tc>
-        <w:tc>
-          <w:tcPr>
-            <w:tcW w:w="4573" w:type="dxa"/>
-            <w:shd w:val="clear" w:color="auto" w:fill="auto"/>
-          </w:tcPr>
-          <w:p>
-            <w:pPr>
               <w:ind w:left="142" w:hanging="142"/>
               <w:jc w:val="center"/>
               <w:rPr>
@@ -860,7 +1076,7 @@
     <w:p/>
     <w:sectPr>
       <w:pgSz w:w="11906" w:h="16838" w:code="9"/>
-      <w:pgMar w:top="567" w:right="1134" w:bottom="1134" w:left="1701" w:header="720" w:footer="720" w:gutter="0"/>
+      <w:pgMar w:top="567" w:right="1134" w:bottom="794" w:left="1701" w:header="720" w:footer="720" w:gutter="0"/>
       <w:cols w:space="720"/>
       <w:docGrid w:linePitch="360"/>
     </w:sectPr>

</xml_diff>